<commit_message>
documentos de caso de uso revisados de acordo com os protótipos das telas e alteração dos nomes dos Wireframes. resolve #21
</commit_message>
<xml_diff>
--- a/Requisitos/Documentos de Casos de Uso/CSU04 - ManterAgendamentoServico.docx
+++ b/Requisitos/Documentos de Casos de Uso/CSU04 - ManterAgendamentoServico.docx
@@ -18,25 +18,7 @@
           <w:sz w:val="36"/>
           <w:szCs w:val="36"/>
         </w:rPr>
-        <w:t>CSU0</w:t>
-      </w:r>
-      <w:r>
-        <w:rPr>
-          <w:b/>
-          <w:color w:val="FF0000"/>
-          <w:sz w:val="36"/>
-          <w:szCs w:val="36"/>
-        </w:rPr>
-        <w:t>4</w:t>
-      </w:r>
-      <w:r>
-        <w:rPr>
-          <w:b/>
-          <w:color w:val="FF0000"/>
-          <w:sz w:val="36"/>
-          <w:szCs w:val="36"/>
-        </w:rPr>
-        <w:t xml:space="preserve">: </w:t>
+        <w:t xml:space="preserve">CSU04: </w:t>
       </w:r>
       <w:r>
         <w:rPr>
@@ -44,15 +26,7 @@
           <w:sz w:val="36"/>
           <w:szCs w:val="36"/>
         </w:rPr>
-        <w:t xml:space="preserve">Manter </w:t>
-      </w:r>
-      <w:r>
-        <w:rPr>
-          <w:b/>
-          <w:sz w:val="36"/>
-          <w:szCs w:val="36"/>
-        </w:rPr>
-        <w:t>Agendamento Serviço</w:t>
+        <w:t>Manter Agendamento Serviço</w:t>
       </w:r>
     </w:p>
     <w:p>
@@ -222,21 +196,7 @@
                 <w:sz w:val="28"/>
                 <w:szCs w:val="28"/>
               </w:rPr>
-              <w:t>C</w:t>
-            </w:r>
-            <w:r>
-              <w:rPr>
-                <w:sz w:val="28"/>
-                <w:szCs w:val="28"/>
-              </w:rPr>
-              <w:t>l</w:t>
-            </w:r>
-            <w:r>
-              <w:rPr>
-                <w:sz w:val="28"/>
-                <w:szCs w:val="28"/>
-              </w:rPr>
-              <w:t>iente</w:t>
+              <w:t>Cliente</w:t>
             </w:r>
           </w:p>
         </w:tc>
@@ -358,13 +318,7 @@
               <w:rPr>
                 <w:sz w:val="28"/>
               </w:rPr>
-              <w:t>Agendamento registrado e pagamento confirmado no sistema</w:t>
-            </w:r>
-            <w:r>
-              <w:rPr>
-                <w:sz w:val="28"/>
-              </w:rPr>
-              <w:t>.</w:t>
+              <w:t>Agendamento registrado e pagamento confirmado no sistema.</w:t>
             </w:r>
           </w:p>
         </w:tc>
@@ -418,33 +372,14 @@
               <w:rPr>
                 <w:sz w:val="28"/>
               </w:rPr>
-              <w:t>Ator pressiona botão “S</w:t>
-            </w:r>
-            <w:r>
-              <w:rPr>
-                <w:sz w:val="28"/>
-              </w:rPr>
-              <w:t>olicitar novo serviço</w:t>
-            </w:r>
-            <w:r>
-              <w:rPr>
-                <w:sz w:val="28"/>
-              </w:rPr>
-              <w:t>” (</w:t>
+              <w:t>Ator pressiona botão “Solicitar novo serviço” (</w:t>
             </w:r>
             <w:r>
               <w:rPr>
                 <w:color w:val="FF0000"/>
                 <w:sz w:val="28"/>
               </w:rPr>
-              <w:t>Tela_00</w:t>
-            </w:r>
-            <w:r>
-              <w:rPr>
-                <w:color w:val="FF0000"/>
-                <w:sz w:val="28"/>
-              </w:rPr>
-              <w:t>5</w:t>
+              <w:t>Tela_005</w:t>
             </w:r>
             <w:r>
               <w:rPr>
@@ -467,27 +402,14 @@
               <w:rPr>
                 <w:sz w:val="28"/>
               </w:rPr>
-              <w:t xml:space="preserve">Sistema exibe tela para buscar serviços </w:t>
-            </w:r>
-            <w:r>
-              <w:rPr>
-                <w:sz w:val="28"/>
-              </w:rPr>
-              <w:t xml:space="preserve"> (</w:t>
+              <w:t>Sistema exibe tela para buscar serviços  (</w:t>
             </w:r>
             <w:r>
               <w:rPr>
                 <w:color w:val="FF0000"/>
                 <w:sz w:val="28"/>
               </w:rPr>
-              <w:t>Tela_00</w:t>
-            </w:r>
-            <w:r>
-              <w:rPr>
-                <w:color w:val="FF0000"/>
-                <w:sz w:val="28"/>
-              </w:rPr>
-              <w:t>1</w:t>
+              <w:t>Tela_001</w:t>
             </w:r>
             <w:r>
               <w:rPr>
@@ -527,45 +449,14 @@
               <w:rPr>
                 <w:sz w:val="28"/>
               </w:rPr>
-              <w:t xml:space="preserve">Sistema exibe tela para </w:t>
-            </w:r>
-            <w:r>
-              <w:rPr>
-                <w:sz w:val="28"/>
-              </w:rPr>
-              <w:t>selecionar as opções de serviço</w:t>
-            </w:r>
-            <w:r>
-              <w:rPr>
-                <w:sz w:val="28"/>
-              </w:rPr>
-              <w:t xml:space="preserve"> </w:t>
-            </w:r>
-            <w:r>
-              <w:rPr>
-                <w:sz w:val="28"/>
-              </w:rPr>
-              <w:t xml:space="preserve">com valor fixo ou com orçamento </w:t>
-            </w:r>
-            <w:r>
-              <w:rPr>
-                <w:sz w:val="28"/>
-              </w:rPr>
-              <w:t>(</w:t>
+              <w:t>Sistema exibe tela para selecionar as opções de serviço com valor fixo ou com orçamento (</w:t>
             </w:r>
             <w:r>
               <w:rPr>
                 <w:color w:val="FF0000"/>
                 <w:sz w:val="28"/>
               </w:rPr>
-              <w:t>Tela_00</w:t>
-            </w:r>
-            <w:r>
-              <w:rPr>
-                <w:color w:val="FF0000"/>
-                <w:sz w:val="28"/>
-              </w:rPr>
-              <w:t>7</w:t>
+              <w:t>Tela_007</w:t>
             </w:r>
             <w:r>
               <w:rPr>
@@ -588,7 +479,37 @@
               <w:rPr>
                 <w:sz w:val="28"/>
               </w:rPr>
-              <w:t>O Ator seleciona "Opção com valor fixo" e clica no botão "Avançar"</w:t>
+              <w:t>A</w:t>
+            </w:r>
+            <w:r>
+              <w:rPr>
+                <w:sz w:val="28"/>
+              </w:rPr>
+              <w:t xml:space="preserve">tor seleciona </w:t>
+            </w:r>
+            <w:r>
+              <w:rPr>
+                <w:sz w:val="28"/>
+              </w:rPr>
+              <w:t>as opções com valor fixo</w:t>
+            </w:r>
+            <w:r>
+              <w:rPr>
+                <w:sz w:val="28"/>
+              </w:rPr>
+              <w:t xml:space="preserve"> e clica no botão "Avançar</w:t>
+            </w:r>
+            <w:r>
+              <w:rPr>
+                <w:sz w:val="28"/>
+              </w:rPr>
+              <w:t xml:space="preserve"> para Fotos</w:t>
+            </w:r>
+            <w:r>
+              <w:rPr>
+                <w:sz w:val="28"/>
+              </w:rPr>
+              <w:t>"</w:t>
             </w:r>
           </w:p>
           <w:p>
@@ -605,33 +526,27 @@
               <w:rPr>
                 <w:sz w:val="28"/>
               </w:rPr>
-              <w:t xml:space="preserve">Sistema </w:t>
-            </w:r>
-            <w:r>
-              <w:rPr>
-                <w:sz w:val="28"/>
-              </w:rPr>
-              <w:t>exibe tela para confirmar qual será a forma de pagamento, se “Pix” ou “Cartão de Crédito” (</w:t>
+              <w:t>Sistema exibe tela para Registro Fotográfico</w:t>
+            </w:r>
+            <w:r>
+              <w:rPr>
+                <w:sz w:val="28"/>
+              </w:rPr>
+              <w:t xml:space="preserve"> (</w:t>
             </w:r>
             <w:r>
               <w:rPr>
                 <w:color w:val="FF0000"/>
                 <w:sz w:val="28"/>
               </w:rPr>
-              <w:t>Tela_00</w:t>
+              <w:t>Tela_0</w:t>
             </w:r>
             <w:r>
               <w:rPr>
                 <w:color w:val="FF0000"/>
                 <w:sz w:val="28"/>
               </w:rPr>
-              <w:t>8</w:t>
-            </w:r>
-            <w:r>
-              <w:rPr>
-                <w:sz w:val="28"/>
-              </w:rPr>
-              <w:t>)</w:t>
+              <w:t>15)</w:t>
             </w:r>
           </w:p>
           <w:p>
@@ -648,7 +563,13 @@
               <w:rPr>
                 <w:sz w:val="28"/>
               </w:rPr>
-              <w:t>O Ator escolhe a forma de pagamento e confirma</w:t>
+              <w:t xml:space="preserve">Ator </w:t>
+            </w:r>
+            <w:r>
+              <w:rPr>
+                <w:sz w:val="28"/>
+              </w:rPr>
+              <w:t>anexa as fotos e clica no botão “Concluir Solicitação Técnica”</w:t>
             </w:r>
           </w:p>
           <w:p>
@@ -665,27 +586,67 @@
               <w:rPr>
                 <w:sz w:val="28"/>
               </w:rPr>
-              <w:t xml:space="preserve">Sistema registra o agendamento e retorna o Ator para a tela principal </w:t>
-            </w:r>
-            <w:r>
-              <w:rPr>
-                <w:sz w:val="28"/>
-              </w:rPr>
-              <w:t>(</w:t>
+              <w:t>Sistema exibe tela para confirmar qual será a forma de pagamento, se “Pix” ou “Cartão de Crédito” (</w:t>
             </w:r>
             <w:r>
               <w:rPr>
                 <w:color w:val="FF0000"/>
                 <w:sz w:val="28"/>
               </w:rPr>
-              <w:t>Tela_00</w:t>
+              <w:t>Tela_008</w:t>
+            </w:r>
+            <w:r>
+              <w:rPr>
+                <w:sz w:val="28"/>
+              </w:rPr>
+              <w:t>)</w:t>
+            </w:r>
+          </w:p>
+          <w:p>
+            <w:pPr>
+              <w:numPr>
+                <w:ilvl w:val="0"/>
+                <w:numId w:val="1"/>
+              </w:numPr>
+              <w:rPr>
+                <w:sz w:val="28"/>
+              </w:rPr>
+            </w:pPr>
+            <w:r>
+              <w:rPr>
+                <w:sz w:val="28"/>
+              </w:rPr>
+              <w:t xml:space="preserve">O Ator escolhe a forma de pagamento e </w:t>
+            </w:r>
+            <w:r>
+              <w:rPr>
+                <w:sz w:val="28"/>
+              </w:rPr>
+              <w:t>clica em “Reter Saldo com Segurança”</w:t>
+            </w:r>
+          </w:p>
+          <w:p>
+            <w:pPr>
+              <w:numPr>
+                <w:ilvl w:val="0"/>
+                <w:numId w:val="1"/>
+              </w:numPr>
+              <w:rPr>
+                <w:sz w:val="28"/>
+              </w:rPr>
+            </w:pPr>
+            <w:r>
+              <w:rPr>
+                <w:sz w:val="28"/>
+              </w:rPr>
+              <w:t>Sistema registra o agendamento e retorna o Ator para a tela principal (</w:t>
             </w:r>
             <w:r>
               <w:rPr>
                 <w:color w:val="FF0000"/>
                 <w:sz w:val="28"/>
               </w:rPr>
-              <w:t>5</w:t>
+              <w:t>Tela_005</w:t>
             </w:r>
             <w:r>
               <w:rPr>
@@ -752,67 +713,26 @@
                 <w:bCs/>
                 <w:sz w:val="28"/>
               </w:rPr>
-              <w:t xml:space="preserve">Linha </w:t>
-            </w:r>
-            <w:r>
-              <w:rPr>
-                <w:b/>
-                <w:bCs/>
-                <w:sz w:val="28"/>
-              </w:rPr>
-              <w:t>3</w:t>
-            </w:r>
-            <w:r>
-              <w:rPr>
-                <w:b/>
-                <w:bCs/>
-                <w:sz w:val="28"/>
-              </w:rPr>
-              <w:t>:</w:t>
-            </w:r>
-            <w:r>
-              <w:rPr>
-                <w:sz w:val="28"/>
-              </w:rPr>
-              <w:t xml:space="preserve"> Ator pression</w:t>
-            </w:r>
-            <w:r>
-              <w:rPr>
-                <w:sz w:val="28"/>
-              </w:rPr>
-              <w:t xml:space="preserve">a botão “Preciso de Outro Serviço”. Segue para a </w:t>
-            </w:r>
-            <w:r>
-              <w:rPr>
-                <w:sz w:val="28"/>
-              </w:rPr>
-              <w:t>(</w:t>
+              <w:t>Linha 3:</w:t>
+            </w:r>
+            <w:r>
+              <w:rPr>
+                <w:sz w:val="28"/>
+              </w:rPr>
+              <w:t xml:space="preserve"> Ator pressiona botão “Preciso de Outro Serviço”. Segue para a (</w:t>
             </w:r>
             <w:r>
               <w:rPr>
                 <w:color w:val="FF0000"/>
                 <w:sz w:val="28"/>
               </w:rPr>
-              <w:t>Tela_0</w:t>
-            </w:r>
-            <w:r>
-              <w:rPr>
-                <w:color w:val="FF0000"/>
-                <w:sz w:val="28"/>
-              </w:rPr>
-              <w:t>15</w:t>
-            </w:r>
-            <w:r>
-              <w:rPr>
-                <w:sz w:val="28"/>
-              </w:rPr>
-              <w:t>)</w:t>
-            </w:r>
-            <w:r>
-              <w:rPr>
-                <w:sz w:val="28"/>
-              </w:rPr>
-              <w:t xml:space="preserve"> onde Cliente poderá solicitar serviço específico, com ou sem foto.</w:t>
+              <w:t>Tela_015</w:t>
+            </w:r>
+            <w:r>
+              <w:rPr>
+                <w:sz w:val="28"/>
+              </w:rPr>
+              <w:t>) onde Cliente poderá solicitar serviço específico, com ou sem foto.</w:t>
             </w:r>
           </w:p>
           <w:p>
@@ -832,204 +752,13 @@
                 <w:bCs/>
                 <w:sz w:val="28"/>
               </w:rPr>
-              <w:t xml:space="preserve">Linha </w:t>
-            </w:r>
-            <w:r>
-              <w:rPr>
-                <w:b/>
-                <w:bCs/>
-                <w:sz w:val="28"/>
-              </w:rPr>
-              <w:t>5</w:t>
-            </w:r>
-            <w:r>
-              <w:rPr>
-                <w:b/>
-                <w:bCs/>
-                <w:sz w:val="28"/>
-              </w:rPr>
-              <w:t>:</w:t>
-            </w:r>
-            <w:r>
-              <w:rPr>
-                <w:sz w:val="28"/>
-              </w:rPr>
-              <w:t xml:space="preserve"> </w:t>
-            </w:r>
-            <w:r>
-              <w:rPr>
-                <w:sz w:val="28"/>
-              </w:rPr>
-              <w:t>Ator visualiza perfil do profissional antes de confirma</w:t>
-            </w:r>
-            <w:r>
-              <w:rPr>
-                <w:sz w:val="28"/>
-              </w:rPr>
-              <w:t xml:space="preserve">r. Sistema vai para </w:t>
-            </w:r>
-            <w:r>
-              <w:rPr>
-                <w:sz w:val="28"/>
-              </w:rPr>
-              <w:t>(</w:t>
-            </w:r>
-            <w:r>
-              <w:rPr>
-                <w:color w:val="FF0000"/>
-                <w:sz w:val="28"/>
-              </w:rPr>
-              <w:t>Tela_0</w:t>
-            </w:r>
-            <w:r>
-              <w:rPr>
-                <w:color w:val="FF0000"/>
-                <w:sz w:val="28"/>
-              </w:rPr>
-              <w:t>14</w:t>
-            </w:r>
-            <w:r>
-              <w:rPr>
-                <w:sz w:val="28"/>
-              </w:rPr>
-              <w:t>)</w:t>
-            </w:r>
-            <w:r>
-              <w:rPr>
-                <w:sz w:val="28"/>
-              </w:rPr>
-              <w:t xml:space="preserve"> .</w:t>
-            </w:r>
-          </w:p>
-          <w:p>
-            <w:pPr>
-              <w:numPr>
-                <w:ilvl w:val="0"/>
-                <w:numId w:val="2"/>
-              </w:numPr>
-              <w:ind w:left="284" w:hanging="284"/>
-              <w:rPr>
-                <w:sz w:val="28"/>
-              </w:rPr>
-            </w:pPr>
-            <w:r>
-              <w:rPr>
-                <w:b/>
-                <w:bCs/>
-                <w:sz w:val="28"/>
-              </w:rPr>
-              <w:t xml:space="preserve">Linha </w:t>
-            </w:r>
-            <w:r>
-              <w:rPr>
-                <w:b/>
-                <w:bCs/>
-                <w:sz w:val="28"/>
-              </w:rPr>
-              <w:t>3</w:t>
-            </w:r>
-            <w:r>
-              <w:rPr>
-                <w:b/>
-                <w:bCs/>
-                <w:sz w:val="28"/>
-              </w:rPr>
-              <w:t>:</w:t>
+              <w:t>Linha 3:</w:t>
             </w:r>
             <w:r>
               <w:rPr>
                 <w:sz w:val="28"/>
               </w:rPr>
               <w:t xml:space="preserve"> Ator pressiona botão “Voltar Home”. Volta para a Linha 1.</w:t>
-            </w:r>
-          </w:p>
-          <w:p>
-            <w:pPr>
-              <w:numPr>
-                <w:ilvl w:val="0"/>
-                <w:numId w:val="2"/>
-              </w:numPr>
-              <w:ind w:left="284" w:hanging="284"/>
-              <w:rPr>
-                <w:sz w:val="28"/>
-              </w:rPr>
-            </w:pPr>
-            <w:r>
-              <w:rPr>
-                <w:b/>
-                <w:bCs/>
-                <w:sz w:val="28"/>
-              </w:rPr>
-              <w:t xml:space="preserve">Linha </w:t>
-            </w:r>
-            <w:r>
-              <w:rPr>
-                <w:b/>
-                <w:bCs/>
-                <w:sz w:val="28"/>
-              </w:rPr>
-              <w:t>1</w:t>
-            </w:r>
-            <w:r>
-              <w:rPr>
-                <w:sz w:val="28"/>
-              </w:rPr>
-              <w:t xml:space="preserve">: Após serviço específico executado e pago, </w:t>
-            </w:r>
-            <w:r>
-              <w:rPr>
-                <w:sz w:val="28"/>
-              </w:rPr>
-              <w:t>A</w:t>
-            </w:r>
-            <w:r>
-              <w:rPr>
-                <w:sz w:val="28"/>
-              </w:rPr>
-              <w:t>tor identifica problema</w:t>
-            </w:r>
-            <w:r>
-              <w:rPr>
-                <w:sz w:val="28"/>
-              </w:rPr>
-              <w:t xml:space="preserve"> e</w:t>
-            </w:r>
-            <w:r>
-              <w:rPr>
-                <w:sz w:val="28"/>
-              </w:rPr>
-              <w:t xml:space="preserve"> pressiona "Solicitar Garantia"</w:t>
-            </w:r>
-            <w:r>
-              <w:rPr>
-                <w:sz w:val="28"/>
-              </w:rPr>
-              <w:t>.</w:t>
-            </w:r>
-            <w:r>
-              <w:rPr>
-                <w:sz w:val="28"/>
-              </w:rPr>
-              <w:t xml:space="preserve"> S</w:t>
-            </w:r>
-            <w:r>
-              <w:rPr>
-                <w:sz w:val="28"/>
-              </w:rPr>
-              <w:t xml:space="preserve">egue para </w:t>
-            </w:r>
-            <w:r>
-              <w:rPr>
-                <w:color w:val="FF0000"/>
-                <w:sz w:val="28"/>
-              </w:rPr>
-              <w:t>CSU09</w:t>
-            </w:r>
-            <w:r>
-              <w:rPr>
-                <w:sz w:val="28"/>
-              </w:rPr>
-              <w:t>.</w:t>
             </w:r>
           </w:p>
         </w:tc>
@@ -1089,31 +818,10 @@
               <w:rPr>
                 <w:b/>
               </w:rPr>
-              <w:t xml:space="preserve">Linha </w:t>
-            </w:r>
-            <w:r>
-              <w:rPr>
-                <w:b/>
-              </w:rPr>
-              <w:t>8</w:t>
-            </w:r>
-            <w:r>
-              <w:t xml:space="preserve">: </w:t>
-            </w:r>
-            <w:r>
-              <w:t>Pagamento recusado. O Sistema deve informar: “Não foi possível processar o pagamento</w:t>
-            </w:r>
-            <w:r>
-              <w:t>.</w:t>
-            </w:r>
-            <w:r>
-              <w:t xml:space="preserve"> Tente novamente.”.</w:t>
-            </w:r>
-            <w:r>
-              <w:t xml:space="preserve"> </w:t>
-            </w:r>
-            <w:r>
-              <w:t>Volta para linha 6.</w:t>
+              <w:t>Linha 8</w:t>
+            </w:r>
+            <w:r>
+              <w:t>: Pagamento recusado. O Sistema deve informar: “Não foi possível processar o pagamento. Tente novamente.”. Volta para linha 6.</w:t>
             </w:r>
           </w:p>
           <w:p>
@@ -1133,19 +841,10 @@
               <w:rPr>
                 <w:b/>
               </w:rPr>
-              <w:t xml:space="preserve">Linha </w:t>
-            </w:r>
-            <w:r>
-              <w:rPr>
-                <w:b/>
-              </w:rPr>
-              <w:t>5</w:t>
-            </w:r>
-            <w:r>
-              <w:t>:</w:t>
-            </w:r>
-            <w:r>
-              <w:t xml:space="preserve"> Ator clica em "Avançar" sem selecionar nenhum serviço. O Sistema deve informar: "Por favor, selecione ao menos um serviço.". Volta para a Linha 4.</w:t>
+              <w:t>Linha 5</w:t>
+            </w:r>
+            <w:r>
+              <w:t>: Ator clica em "Avançar" sem selecionar nenhum serviço. O Sistema deve informar: "Por favor, selecione ao menos um serviço.". Volta para a Linha 4.</w:t>
             </w:r>
           </w:p>
         </w:tc>
@@ -1278,13 +977,7 @@
               <w:jc w:val="center"/>
             </w:pPr>
             <w:r>
-              <w:t>2</w:t>
-            </w:r>
-            <w:r>
-              <w:t>3</w:t>
-            </w:r>
-            <w:r>
-              <w:t>/06/2026</w:t>
+              <w:t>23/06/2026</w:t>
             </w:r>
           </w:p>
         </w:tc>
@@ -1347,6 +1040,9 @@
             <w:pPr>
               <w:jc w:val="center"/>
             </w:pPr>
+            <w:r>
+              <w:t>10/10/2026</w:t>
+            </w:r>
           </w:p>
         </w:tc>
         <w:tc>
@@ -1363,6 +1059,9 @@
             <w:pPr>
               <w:jc w:val="center"/>
             </w:pPr>
+            <w:r>
+              <w:t>Hiakewve</w:t>
+            </w:r>
           </w:p>
         </w:tc>
         <w:tc>
@@ -1379,11 +1078,13 @@
             <w:pPr>
               <w:jc w:val="center"/>
             </w:pPr>
+            <w:r>
+              <w:t>Revisão do documento de acordo com o protótipo da tela</w:t>
+            </w:r>
           </w:p>
         </w:tc>
       </w:tr>
     </w:tbl>
-    <w:p/>
     <w:p/>
     <w:sectPr>
       <w:pgSz w:w="11906" w:h="16838"/>

</xml_diff>

<commit_message>
Atualiza documentos de casos de uso e protótipos com correções de telas e fluxos, incluindo ajustes nas telas de autenticação, cadastro, agendamento e avaliação de serviços. resolve #31
</commit_message>
<xml_diff>
--- a/Requisitos/Documentos de Casos de Uso/CSU04 - ManterAgendamentoServico.docx
+++ b/Requisitos/Documentos de Casos de Uso/CSU04 - ManterAgendamentoServico.docx
@@ -379,7 +379,14 @@
                 <w:color w:val="FF0000"/>
                 <w:sz w:val="28"/>
               </w:rPr>
-              <w:t>Tela_005</w:t>
+              <w:t>Tela_00</w:t>
+            </w:r>
+            <w:r>
+              <w:rPr>
+                <w:color w:val="FF0000"/>
+                <w:sz w:val="28"/>
+              </w:rPr>
+              <w:t>6</w:t>
             </w:r>
             <w:r>
               <w:rPr>
@@ -456,7 +463,14 @@
                 <w:color w:val="FF0000"/>
                 <w:sz w:val="28"/>
               </w:rPr>
-              <w:t>Tela_007</w:t>
+              <w:t>Tela_00</w:t>
+            </w:r>
+            <w:r>
+              <w:rPr>
+                <w:color w:val="FF0000"/>
+                <w:sz w:val="28"/>
+              </w:rPr>
+              <w:t>8</w:t>
             </w:r>
             <w:r>
               <w:rPr>
@@ -539,14 +553,7 @@
                 <w:color w:val="FF0000"/>
                 <w:sz w:val="28"/>
               </w:rPr>
-              <w:t>Tela_0</w:t>
-            </w:r>
-            <w:r>
-              <w:rPr>
-                <w:color w:val="FF0000"/>
-                <w:sz w:val="28"/>
-              </w:rPr>
-              <w:t>15)</w:t>
+              <w:t>Tela_015)</w:t>
             </w:r>
           </w:p>
           <w:p>
@@ -593,7 +600,14 @@
                 <w:color w:val="FF0000"/>
                 <w:sz w:val="28"/>
               </w:rPr>
-              <w:t>Tela_008</w:t>
+              <w:t>Tela_00</w:t>
+            </w:r>
+            <w:r>
+              <w:rPr>
+                <w:color w:val="FF0000"/>
+                <w:sz w:val="28"/>
+              </w:rPr>
+              <w:t>9</w:t>
             </w:r>
             <w:r>
               <w:rPr>
@@ -646,7 +660,14 @@
                 <w:color w:val="FF0000"/>
                 <w:sz w:val="28"/>
               </w:rPr>
-              <w:t>Tela_005</w:t>
+              <w:t>Tela_00</w:t>
+            </w:r>
+            <w:r>
+              <w:rPr>
+                <w:color w:val="FF0000"/>
+                <w:sz w:val="28"/>
+              </w:rPr>
+              <w:t>6</w:t>
             </w:r>
             <w:r>
               <w:rPr>

</xml_diff>